<commit_message>
Remediate Chapter 3 classroom artifacts
Co-authored-by: Cursor <cursoragent@cursor.com>
</commit_message>
<xml_diff>
--- a/production/quizzes/03-ch3-energy-speed-quiz.docx
+++ b/production/quizzes/03-ch3-energy-speed-quiz.docx
@@ -10,6 +10,7 @@
         <w:rPr>
           <w:rFonts w:ascii="Calibri" w:hAnsi="Calibri"/>
           <w:b/>
+          <w:i w:val="0"/>
           <w:color w:val="1B4FC2"/>
           <w:sz w:val="36"/>
         </w:rPr>
@@ -24,6 +25,7 @@
         <w:rPr>
           <w:rFonts w:ascii="Calibri" w:hAnsi="Calibri"/>
           <w:b/>
+          <w:i w:val="0"/>
           <w:color w:val="1A1D26"/>
           <w:sz w:val="24"/>
         </w:rPr>
@@ -38,6 +40,7 @@
         <w:rPr>
           <w:rFonts w:ascii="Calibri" w:hAnsi="Calibri"/>
           <w:b w:val="0"/>
+          <w:i w:val="0"/>
           <w:color w:val="1A1D26"/>
           <w:sz w:val="28"/>
         </w:rPr>
@@ -52,6 +55,7 @@
         <w:rPr>
           <w:rFonts w:ascii="Calibri" w:hAnsi="Calibri"/>
           <w:b/>
+          <w:i w:val="0"/>
           <w:color w:val="1A1D26"/>
           <w:sz w:val="32"/>
         </w:rPr>
@@ -66,6 +70,7 @@
         <w:rPr>
           <w:rFonts w:ascii="Calibri" w:hAnsi="Calibri"/>
           <w:b/>
+          <w:i w:val="0"/>
           <w:color w:val="1A1D26"/>
           <w:sz w:val="28"/>
         </w:rPr>
@@ -80,6 +85,7 @@
         <w:rPr>
           <w:rFonts w:ascii="Calibri" w:hAnsi="Calibri"/>
           <w:b w:val="0"/>
+          <w:i w:val="0"/>
           <w:color w:val="1A1D26"/>
           <w:sz w:val="28"/>
         </w:rPr>
@@ -94,6 +100,7 @@
         <w:rPr>
           <w:rFonts w:ascii="Calibri" w:hAnsi="Calibri"/>
           <w:b/>
+          <w:i w:val="0"/>
           <w:color w:val="1A1D26"/>
           <w:sz w:val="28"/>
         </w:rPr>
@@ -108,6 +115,7 @@
         <w:rPr>
           <w:rFonts w:ascii="Calibri" w:hAnsi="Calibri"/>
           <w:b w:val="0"/>
+          <w:i w:val="0"/>
           <w:color w:val="1A1D26"/>
           <w:sz w:val="28"/>
         </w:rPr>
@@ -122,6 +130,7 @@
         <w:rPr>
           <w:rFonts w:ascii="Calibri" w:hAnsi="Calibri"/>
           <w:b/>
+          <w:i w:val="0"/>
           <w:color w:val="1A1D26"/>
           <w:sz w:val="28"/>
         </w:rPr>
@@ -136,6 +145,7 @@
         <w:rPr>
           <w:rFonts w:ascii="Calibri" w:hAnsi="Calibri"/>
           <w:b w:val="0"/>
+          <w:i w:val="0"/>
           <w:color w:val="1A1D26"/>
           <w:sz w:val="28"/>
         </w:rPr>
@@ -150,6 +160,7 @@
         <w:rPr>
           <w:rFonts w:ascii="Calibri" w:hAnsi="Calibri"/>
           <w:b/>
+          <w:i w:val="0"/>
           <w:color w:val="1A1D26"/>
           <w:sz w:val="28"/>
         </w:rPr>
@@ -164,6 +175,7 @@
         <w:rPr>
           <w:rFonts w:ascii="Calibri" w:hAnsi="Calibri"/>
           <w:b w:val="0"/>
+          <w:i w:val="0"/>
           <w:color w:val="1A1D26"/>
           <w:sz w:val="28"/>
         </w:rPr>
@@ -178,6 +190,7 @@
         <w:rPr>
           <w:rFonts w:ascii="Calibri" w:hAnsi="Calibri"/>
           <w:b/>
+          <w:i w:val="0"/>
           <w:color w:val="1A1D26"/>
           <w:sz w:val="28"/>
         </w:rPr>
@@ -192,6 +205,7 @@
         <w:rPr>
           <w:rFonts w:ascii="Calibri" w:hAnsi="Calibri"/>
           <w:b w:val="0"/>
+          <w:i w:val="0"/>
           <w:color w:val="1A1D26"/>
           <w:sz w:val="28"/>
         </w:rPr>
@@ -206,6 +220,7 @@
         <w:rPr>
           <w:rFonts w:ascii="Calibri" w:hAnsi="Calibri"/>
           <w:b/>
+          <w:i w:val="0"/>
           <w:color w:val="1A1D26"/>
           <w:sz w:val="28"/>
         </w:rPr>
@@ -220,6 +235,7 @@
         <w:rPr>
           <w:rFonts w:ascii="Calibri" w:hAnsi="Calibri"/>
           <w:b w:val="0"/>
+          <w:i w:val="0"/>
           <w:color w:val="1A1D26"/>
           <w:sz w:val="28"/>
         </w:rPr>
@@ -234,6 +250,7 @@
         <w:rPr>
           <w:rFonts w:ascii="Calibri" w:hAnsi="Calibri"/>
           <w:b/>
+          <w:i w:val="0"/>
           <w:color w:val="1A1D26"/>
           <w:sz w:val="28"/>
         </w:rPr>
@@ -248,6 +265,7 @@
         <w:rPr>
           <w:rFonts w:ascii="Calibri" w:hAnsi="Calibri"/>
           <w:b w:val="0"/>
+          <w:i w:val="0"/>
           <w:color w:val="1A1D26"/>
           <w:sz w:val="28"/>
         </w:rPr>
@@ -262,6 +280,7 @@
         <w:rPr>
           <w:rFonts w:ascii="Calibri" w:hAnsi="Calibri"/>
           <w:b/>
+          <w:i w:val="0"/>
           <w:color w:val="1A1D26"/>
           <w:sz w:val="28"/>
         </w:rPr>
@@ -276,6 +295,7 @@
         <w:rPr>
           <w:rFonts w:ascii="Calibri" w:hAnsi="Calibri"/>
           <w:b w:val="0"/>
+          <w:i w:val="0"/>
           <w:color w:val="1A1D26"/>
           <w:sz w:val="28"/>
         </w:rPr>

</xml_diff>